<commit_message>
SSM submission: unstructured abstract, fix von Elm sorting, correct limitations wording, update inline-figure comment
Co-Authored-By: Tatsuki Onishi <bougtoir@gmail.com>
</commit_message>
<xml_diff>
--- a/manuscript/ssm_manuscript_en.docx
+++ b/manuscript/ssm_manuscript_en.docx
@@ -37,7 +37,7 @@
           <w:rFonts w:ascii="Times New Roman" w:hAnsi="Times New Roman"/>
           <w:sz w:val="24"/>
         </w:rPr>
-        <w:t>Rationale: Specialty maldistribution is a persistent health-workforce problem, and malpractice litigation is widely assumed to push physicians away from high-risk specialties. Objective: To test whether specialty-level malpractice-litigation risk predicts subsequent physician supply and hospital facility counts in Japan. Methods: We used national administrative data for 12 clinical specialties from 2008 to 2024. Exposure was malpractice claims per 1,000 physicians; outcomes were biennial log-changes in physician counts and annual log-changes in hospital facility counts. We estimated specialty-and-wave fixed-effects panels with clustered standard errors and applied two one-sided equivalence tests with pre-specified margins of +/-1% and +/-2%. Results: The lagged litigation rate was not associated with physician growth (coefficient -0.0009; 95% CI -0.0043 to +0.0025; p=0.56; n=96) or facility-count growth (p=0.90; n=96). Equivalence testing showed that a one-SD higher rate shifted physician growth by less than +/-1% (TOST p=0.023; point estimate -0.21%; 90% CI -0.84% to +0.42%). Conclusions: Malpractice litigation risk does not appear to drive aggregate specialty maldistribution in Japan. Structural incentives remain more promising policy levers for rebalancing the workforce.</w:t>
+        <w:t>Specialty maldistribution is a persistent health-workforce problem, and malpractice litigation is widely assumed to push physicians away from high-risk specialties. We tested whether specialty-level malpractice-litigation risk predicts subsequent physician supply and hospital facility counts in Japan, using national administrative data for 12 clinical specialties from 2008 to 2024. Exposure was malpractice claims per 1,000 physicians; outcomes were biennial log-changes in physician counts and annual log-changes in hospital facility counts. We estimated specialty-and-wave fixed-effects panels with clustered standard errors and applied two one-sided equivalence tests with pre-specified margins of +/-1% and +/-2%. The lagged litigation rate was not associated with physician growth (coefficient -0.0009; 95% CI -0.0043 to +0.0025; p=0.56; n=96) or facility-count growth (p=0.90; n=96). Equivalence testing showed that a one-SD higher rate shifted physician growth by less than +/-1% (TOST p=0.023; point estimate -0.21%; 90% CI -0.84% to +0.42%). Malpractice litigation risk does not appear to drive aggregate specialty maldistribution in Japan; structural incentives remain more promising policy levers for rebalancing the workforce.</w:t>
       </w:r>
     </w:p>
     <w:p>
@@ -3496,7 +3496,7 @@
           <w:i w:val="0"/>
           <w:sz w:val="24"/>
         </w:rPr>
-        <w:t>This is an ecological, specialty-level analysis and cannot establish individual-level causality. We do not directly observe individual physicians' subjective risk perceptions, so the interpretation of the null result in terms of availability, loss aversion and status-quo bias is theoretically informed rather than directly tested. The 12 specialties correspond to the primary-specialty tier of Japan's two-tiered specialist training programme; the analysis describes workforce allocation at the initial board-certification stage and may not extend to narrower subspecialties that are not separately tracked in the biennial census. The physician census is biennial, giving 9 measured waves; we addressed the limited power directly through equivalence testing and by pooling across specialties, but residual power constraints remain and the equivalence margins are a judgement. Litigation rates may be endogenous to physician supply if a smaller workforce increases workload and hence incidents; the lagged exposure, fixed effects, and reverse specification make reverse causation unlikely, yet unobserved confounders at the specialty or prefecture level cannot be fully ruled out. Cluster block-bootstrap and power diagnostics are reported in Supplementary Table 6. Because clusters are defined by the 12 specialties, the small-cluster correction uses G-1=11 degrees of freedom; this is the minimum at which cluster-level t inference is recommended and is inherent to the data. Specialty-specific litigation counts could be recovered only from 2008; pre-2008 specialty tables were not retrievable from primary sources. Clinic counts by specialty are published only every 3 years and were used descriptively. JMSR report counts are available only from 2015 and were used in a 2016-2024 sensitivity. Media article counts are available only for 2009-2018 and are a national total, so they cannot be decomposed by specialty and are collinear with full wave fixed effects. Litigation counts are assigned to a principal specialty and, by the Court's own note, do not measure intrinsic specialty risk. (Supreme Court of Japan, 2024) Finally, these findings are embedded in the country's particular legal, cultural and institutional context -- including its no-fault obstetric compensation scheme, its fee-for-service reimbursement structure and its comparatively low-volume malpractice-litigation culture -- so physician responses to litigation risk may differ in health systems with different liability regimes, compensation mechanisms or professional norms; the results should not be assumed to generalise across cultural spheres.</w:t>
+        <w:t>This is an ecological, specialty-level analysis and cannot establish individual-level causality. We do not directly observe individual physicians' subjective risk perceptions, so the interpretation of the null result in terms of availability, loss aversion and status-quo bias is theoretically informed rather than directly tested. The 12 specialties correspond to the primary-specialty tier of Japan's two-tiered specialist training programme; the analysis describes workforce allocation at the initial board-certification stage and may not extend to narrower subspecialties that are not separately tracked in the biennial census. The physician census is biennial, giving 9 measured waves; we addressed the limited power directly through equivalence testing and by pooling across specialties, but residual power constraints remain and the equivalence margins are a judgement. Litigation rates may be endogenous to physician supply if a smaller workforce increases workload and hence incidents; the lagged exposure, fixed effects, and reverse specification make reverse causation unlikely, yet unobserved confounders at the specialty or national-policy level cannot be fully ruled out. Cluster block-bootstrap and power diagnostics are reported in Supplementary Table 6. Because clusters are defined by the 12 specialties, the small-cluster correction uses G-1=11 degrees of freedom; this is the minimum at which cluster-level t inference is recommended and is inherent to the data. Specialty-specific litigation counts could be recovered only from 2008; pre-2008 specialty tables were not retrievable from primary sources. Clinic counts by specialty are published only every 3 years and were used descriptively. JMSR report counts are available only from 2015 and were used in a 2016-2024 sensitivity. Media article counts are available only for 2009-2018 and are a national total, so they cannot be decomposed by specialty and are collinear with full wave fixed effects. Litigation counts are assigned to a principal specialty and, by the Court's own note, do not measure intrinsic specialty risk. (Supreme Court of Japan, 2024) Finally, these findings are embedded in the country's particular legal, cultural and institutional context -- including its no-fault obstetric compensation scheme, its fee-for-service reimbursement structure and its comparatively low-volume malpractice-litigation culture -- so physician responses to litigation risk may differ in health systems with different liability regimes, compensation mechanisms or professional norms; the results should not be assumed to generalise across cultural spheres.</w:t>
       </w:r>
     </w:p>
     <w:p>
@@ -3667,6 +3667,56 @@
           <w:sz w:val="20"/>
         </w:rPr>
         <w:t>. 50(2): 317-372.</w:t>
+      </w:r>
+    </w:p>
+    <w:p>
+      <w:pPr>
+        <w:spacing w:line="360" w:lineRule="auto"/>
+      </w:pPr>
+      <w:r>
+        <w:rPr>
+          <w:rFonts w:ascii="Times New Roman" w:hAnsi="Times New Roman"/>
+          <w:b w:val="0"/>
+          <w:i w:val="0"/>
+          <w:sz w:val="20"/>
+        </w:rPr>
+        <w:t>von Elm, E., Altman, D.G., Egger, M., et al. (2007), '</w:t>
+      </w:r>
+      <w:r>
+        <w:rPr>
+          <w:rFonts w:ascii="Times New Roman" w:hAnsi="Times New Roman"/>
+          <w:b w:val="0"/>
+          <w:i w:val="0"/>
+          <w:sz w:val="20"/>
+        </w:rPr>
+        <w:t>The STROBE statement</w:t>
+      </w:r>
+      <w:r>
+        <w:rPr>
+          <w:rFonts w:ascii="Times New Roman" w:hAnsi="Times New Roman"/>
+          <w:b w:val="0"/>
+          <w:i w:val="0"/>
+          <w:sz w:val="20"/>
+        </w:rPr>
+        <w:t xml:space="preserve">', </w:t>
+      </w:r>
+      <w:r>
+        <w:rPr>
+          <w:rFonts w:ascii="Times New Roman" w:hAnsi="Times New Roman"/>
+          <w:b w:val="0"/>
+          <w:i/>
+          <w:sz w:val="20"/>
+        </w:rPr>
+        <w:t>Lancet</w:t>
+      </w:r>
+      <w:r>
+        <w:rPr>
+          <w:rFonts w:ascii="Times New Roman" w:hAnsi="Times New Roman"/>
+          <w:b w:val="0"/>
+          <w:i w:val="0"/>
+          <w:sz w:val="20"/>
+        </w:rPr>
+        <w:t>. 370(9596): 1453-1457.</w:t>
       </w:r>
     </w:p>
     <w:p>
@@ -4955,56 +5005,6 @@
     </w:p>
     <w:p>
       <w:pPr>
-        <w:spacing w:line="360" w:lineRule="auto"/>
-      </w:pPr>
-      <w:r>
-        <w:rPr>
-          <w:rFonts w:ascii="Times New Roman" w:hAnsi="Times New Roman"/>
-          <w:b w:val="0"/>
-          <w:i w:val="0"/>
-          <w:sz w:val="20"/>
-        </w:rPr>
-        <w:t>von Elm, E., Altman, D.G., Egger, M., et al. (2007), '</w:t>
-      </w:r>
-      <w:r>
-        <w:rPr>
-          <w:rFonts w:ascii="Times New Roman" w:hAnsi="Times New Roman"/>
-          <w:b w:val="0"/>
-          <w:i w:val="0"/>
-          <w:sz w:val="20"/>
-        </w:rPr>
-        <w:t>The STROBE statement</w:t>
-      </w:r>
-      <w:r>
-        <w:rPr>
-          <w:rFonts w:ascii="Times New Roman" w:hAnsi="Times New Roman"/>
-          <w:b w:val="0"/>
-          <w:i w:val="0"/>
-          <w:sz w:val="20"/>
-        </w:rPr>
-        <w:t xml:space="preserve">', </w:t>
-      </w:r>
-      <w:r>
-        <w:rPr>
-          <w:rFonts w:ascii="Times New Roman" w:hAnsi="Times New Roman"/>
-          <w:b w:val="0"/>
-          <w:i/>
-          <w:sz w:val="20"/>
-        </w:rPr>
-        <w:t>Lancet</w:t>
-      </w:r>
-      <w:r>
-        <w:rPr>
-          <w:rFonts w:ascii="Times New Roman" w:hAnsi="Times New Roman"/>
-          <w:b w:val="0"/>
-          <w:i w:val="0"/>
-          <w:sz w:val="20"/>
-        </w:rPr>
-        <w:t>. 370(9596): 1453-1457.</w:t>
-      </w:r>
-    </w:p>
-    <w:p>
-      <w:pPr>
         <w:pStyle w:val="Heading1"/>
       </w:pPr>
       <w:r>

</xml_diff>